<commit_message>
Agregar imágenes y actualizar README
</commit_message>
<xml_diff>
--- a/Evidencias_Github/Imagenes.docx
+++ b/Evidencias_Github/Imagenes.docx
@@ -431,6 +431,330 @@
     <w:p>
       <w:r>
         <w:lastRenderedPageBreak/>
+        <w:t xml:space="preserve">Git log </w:t>
+      </w:r>
+      <w:r>
+        <w:t xml:space="preserve">(sirve para ver el historial de cambios - </w:t>
+      </w:r>
+      <w:proofErr w:type="spellStart"/>
+      <w:r>
+        <w:t>commits</w:t>
+      </w:r>
+      <w:proofErr w:type="spellEnd"/>
+      <w:r>
+        <w:t>)</w:t>
+      </w:r>
+    </w:p>
+    <w:p>
+      <w:r>
+        <w:rPr>
+          <w:noProof/>
+        </w:rPr>
+        <w:drawing>
+          <wp:anchor distT="0" distB="0" distL="114300" distR="114300" simplePos="0" relativeHeight="251658240" behindDoc="1" locked="0" layoutInCell="1" allowOverlap="1" wp14:anchorId="0B5FE47F" wp14:editId="3E855F2F">
+            <wp:simplePos x="0" y="0"/>
+            <wp:positionH relativeFrom="column">
+              <wp:posOffset>0</wp:posOffset>
+            </wp:positionH>
+            <wp:positionV relativeFrom="paragraph">
+              <wp:posOffset>139641</wp:posOffset>
+            </wp:positionV>
+            <wp:extent cx="5400040" cy="5953125"/>
+            <wp:effectExtent l="0" t="0" r="0" b="0"/>
+            <wp:wrapNone/>
+            <wp:docPr id="1404337017" name="Imagen 1"/>
+            <wp:cNvGraphicFramePr>
+              <a:graphicFrameLocks xmlns:a="http://schemas.openxmlformats.org/drawingml/2006/main" noChangeAspect="1"/>
+            </wp:cNvGraphicFramePr>
+            <a:graphic xmlns:a="http://schemas.openxmlformats.org/drawingml/2006/main">
+              <a:graphicData uri="http://schemas.openxmlformats.org/drawingml/2006/picture">
+                <pic:pic xmlns:pic="http://schemas.openxmlformats.org/drawingml/2006/picture">
+                  <pic:nvPicPr>
+                    <pic:cNvPr id="1404337017" name="Imagen 1404337017"/>
+                    <pic:cNvPicPr/>
+                  </pic:nvPicPr>
+                  <pic:blipFill>
+                    <a:blip r:embed="rId11" cstate="print">
+                      <a:extLst>
+                        <a:ext uri="{28A0092B-C50C-407E-A947-70E740481C1C}">
+                          <a14:useLocalDpi xmlns:a14="http://schemas.microsoft.com/office/drawing/2010/main" val="0"/>
+                        </a:ext>
+                      </a:extLst>
+                    </a:blip>
+                    <a:stretch>
+                      <a:fillRect/>
+                    </a:stretch>
+                  </pic:blipFill>
+                  <pic:spPr>
+                    <a:xfrm>
+                      <a:off x="0" y="0"/>
+                      <a:ext cx="5400040" cy="5953125"/>
+                    </a:xfrm>
+                    <a:prstGeom prst="rect">
+                      <a:avLst/>
+                    </a:prstGeom>
+                  </pic:spPr>
+                </pic:pic>
+              </a:graphicData>
+            </a:graphic>
+            <wp14:sizeRelH relativeFrom="page">
+              <wp14:pctWidth>0</wp14:pctWidth>
+            </wp14:sizeRelH>
+            <wp14:sizeRelV relativeFrom="page">
+              <wp14:pctHeight>0</wp14:pctHeight>
+            </wp14:sizeRelV>
+          </wp:anchor>
+        </w:drawing>
+      </w:r>
+    </w:p>
+    <w:p/>
+    <w:p/>
+    <w:p/>
+    <w:p/>
+    <w:p/>
+    <w:p/>
+    <w:p/>
+    <w:p/>
+    <w:p/>
+    <w:p/>
+    <w:p/>
+    <w:p/>
+    <w:p/>
+    <w:p/>
+    <w:p/>
+    <w:p/>
+    <w:p/>
+    <w:p/>
+    <w:p/>
+    <w:p/>
+    <w:p/>
+    <w:p/>
+    <w:p/>
+    <w:p/>
+    <w:p/>
+    <w:p/>
+    <w:p/>
+    <w:p/>
+    <w:p/>
+    <w:p/>
+    <w:p/>
+    <w:p/>
+    <w:p/>
+    <w:p/>
+    <w:p/>
+    <w:p/>
+    <w:p/>
+    <w:p/>
+    <w:p/>
+    <w:p/>
+    <w:p/>
+    <w:p/>
+    <w:p/>
+    <w:p/>
+    <w:p/>
+    <w:p/>
+    <w:p/>
+    <w:p/>
+    <w:p/>
+    <w:p/>
+    <w:p/>
+    <w:p/>
+    <w:p/>
+    <w:p/>
+    <w:p/>
+    <w:p/>
+    <w:p/>
+    <w:p/>
+    <w:p/>
+    <w:p/>
+    <w:p>
+      <w:r>
+        <w:rPr>
+          <w:noProof/>
+        </w:rPr>
+        <w:lastRenderedPageBreak/>
+        <w:drawing>
+          <wp:anchor distT="0" distB="0" distL="114300" distR="114300" simplePos="0" relativeHeight="251659264" behindDoc="1" locked="0" layoutInCell="1" allowOverlap="1" wp14:anchorId="3064F813" wp14:editId="1A54B3E0">
+            <wp:simplePos x="0" y="0"/>
+            <wp:positionH relativeFrom="column">
+              <wp:posOffset>-66612</wp:posOffset>
+            </wp:positionH>
+            <wp:positionV relativeFrom="paragraph">
+              <wp:posOffset>135348</wp:posOffset>
+            </wp:positionV>
+            <wp:extent cx="5400040" cy="6468110"/>
+            <wp:effectExtent l="0" t="0" r="0" b="0"/>
+            <wp:wrapNone/>
+            <wp:docPr id="44710437" name="Imagen 2"/>
+            <wp:cNvGraphicFramePr>
+              <a:graphicFrameLocks xmlns:a="http://schemas.openxmlformats.org/drawingml/2006/main" noChangeAspect="1"/>
+            </wp:cNvGraphicFramePr>
+            <a:graphic xmlns:a="http://schemas.openxmlformats.org/drawingml/2006/main">
+              <a:graphicData uri="http://schemas.openxmlformats.org/drawingml/2006/picture">
+                <pic:pic xmlns:pic="http://schemas.openxmlformats.org/drawingml/2006/picture">
+                  <pic:nvPicPr>
+                    <pic:cNvPr id="44710437" name="Imagen 44710437"/>
+                    <pic:cNvPicPr/>
+                  </pic:nvPicPr>
+                  <pic:blipFill>
+                    <a:blip r:embed="rId12" cstate="print">
+                      <a:extLst>
+                        <a:ext uri="{28A0092B-C50C-407E-A947-70E740481C1C}">
+                          <a14:useLocalDpi xmlns:a14="http://schemas.microsoft.com/office/drawing/2010/main" val="0"/>
+                        </a:ext>
+                      </a:extLst>
+                    </a:blip>
+                    <a:stretch>
+                      <a:fillRect/>
+                    </a:stretch>
+                  </pic:blipFill>
+                  <pic:spPr>
+                    <a:xfrm>
+                      <a:off x="0" y="0"/>
+                      <a:ext cx="5400040" cy="6468110"/>
+                    </a:xfrm>
+                    <a:prstGeom prst="rect">
+                      <a:avLst/>
+                    </a:prstGeom>
+                  </pic:spPr>
+                </pic:pic>
+              </a:graphicData>
+            </a:graphic>
+            <wp14:sizeRelH relativeFrom="page">
+              <wp14:pctWidth>0</wp14:pctWidth>
+            </wp14:sizeRelH>
+            <wp14:sizeRelV relativeFrom="page">
+              <wp14:pctHeight>0</wp14:pctHeight>
+            </wp14:sizeRelV>
+          </wp:anchor>
+        </w:drawing>
+      </w:r>
+    </w:p>
+    <w:p/>
+    <w:p/>
+    <w:p/>
+    <w:p/>
+    <w:p/>
+    <w:p/>
+    <w:p/>
+    <w:p/>
+    <w:p/>
+    <w:p/>
+    <w:p/>
+    <w:p/>
+    <w:p/>
+    <w:p/>
+    <w:p/>
+    <w:p/>
+    <w:p/>
+    <w:p/>
+    <w:p/>
+    <w:p/>
+    <w:p/>
+    <w:p/>
+    <w:p/>
+    <w:p/>
+    <w:p/>
+    <w:p/>
+    <w:p/>
+    <w:p/>
+    <w:p/>
+    <w:p/>
+    <w:p/>
+    <w:p/>
+    <w:p/>
+    <w:p/>
+    <w:p/>
+    <w:p/>
+    <w:p/>
+    <w:p/>
+    <w:p/>
+    <w:p/>
+    <w:p/>
+    <w:p/>
+    <w:p>
+      <w:r>
+        <w:rPr>
+          <w:noProof/>
+        </w:rPr>
+        <w:drawing>
+          <wp:anchor distT="0" distB="0" distL="114300" distR="114300" simplePos="0" relativeHeight="251660288" behindDoc="1" locked="0" layoutInCell="1" allowOverlap="1" wp14:anchorId="290C107A" wp14:editId="7924F840">
+            <wp:simplePos x="0" y="0"/>
+            <wp:positionH relativeFrom="column">
+              <wp:posOffset>-139280</wp:posOffset>
+            </wp:positionH>
+            <wp:positionV relativeFrom="paragraph">
+              <wp:posOffset>85864</wp:posOffset>
+            </wp:positionV>
+            <wp:extent cx="5400040" cy="1678305"/>
+            <wp:effectExtent l="0" t="0" r="0" b="0"/>
+            <wp:wrapNone/>
+            <wp:docPr id="2045517592" name="Imagen 3"/>
+            <wp:cNvGraphicFramePr>
+              <a:graphicFrameLocks xmlns:a="http://schemas.openxmlformats.org/drawingml/2006/main" noChangeAspect="1"/>
+            </wp:cNvGraphicFramePr>
+            <a:graphic xmlns:a="http://schemas.openxmlformats.org/drawingml/2006/main">
+              <a:graphicData uri="http://schemas.openxmlformats.org/drawingml/2006/picture">
+                <pic:pic xmlns:pic="http://schemas.openxmlformats.org/drawingml/2006/picture">
+                  <pic:nvPicPr>
+                    <pic:cNvPr id="2045517592" name="Imagen 2045517592"/>
+                    <pic:cNvPicPr/>
+                  </pic:nvPicPr>
+                  <pic:blipFill>
+                    <a:blip r:embed="rId13" cstate="print">
+                      <a:extLst>
+                        <a:ext uri="{28A0092B-C50C-407E-A947-70E740481C1C}">
+                          <a14:useLocalDpi xmlns:a14="http://schemas.microsoft.com/office/drawing/2010/main" val="0"/>
+                        </a:ext>
+                      </a:extLst>
+                    </a:blip>
+                    <a:stretch>
+                      <a:fillRect/>
+                    </a:stretch>
+                  </pic:blipFill>
+                  <pic:spPr>
+                    <a:xfrm>
+                      <a:off x="0" y="0"/>
+                      <a:ext cx="5400040" cy="1678305"/>
+                    </a:xfrm>
+                    <a:prstGeom prst="rect">
+                      <a:avLst/>
+                    </a:prstGeom>
+                  </pic:spPr>
+                </pic:pic>
+              </a:graphicData>
+            </a:graphic>
+            <wp14:sizeRelH relativeFrom="page">
+              <wp14:pctWidth>0</wp14:pctWidth>
+            </wp14:sizeRelH>
+            <wp14:sizeRelV relativeFrom="page">
+              <wp14:pctHeight>0</wp14:pctHeight>
+            </wp14:sizeRelV>
+          </wp:anchor>
+        </w:drawing>
+      </w:r>
+    </w:p>
+    <w:p/>
+    <w:p/>
+    <w:p/>
+    <w:p/>
+    <w:p/>
+    <w:p/>
+    <w:p/>
+    <w:p/>
+    <w:p/>
+    <w:p/>
+    <w:p/>
+    <w:p/>
+    <w:p/>
+    <w:p/>
+    <w:p/>
+    <w:p/>
+    <w:p/>
+    <w:p/>
+    <w:p>
+      <w:r>
+        <w:lastRenderedPageBreak/>
         <w:t>Subir Carpeta Integrantes:</w:t>
       </w:r>
     </w:p>
@@ -447,28 +771,12 @@
           <w:lang w:val="es-PE"/>
         </w:rPr>
       </w:pPr>
-      <w:proofErr w:type="spellStart"/>
       <w:r>
         <w:rPr>
           <w:lang w:val="es-PE"/>
         </w:rPr>
-        <w:t>git</w:t>
-      </w:r>
-      <w:proofErr w:type="spellEnd"/>
-      <w:r>
-        <w:rPr>
-          <w:lang w:val="es-PE"/>
-        </w:rPr>
-        <w:t xml:space="preserve"> </w:t>
-      </w:r>
-      <w:proofErr w:type="spellStart"/>
-      <w:r>
-        <w:rPr>
-          <w:lang w:val="es-PE"/>
-        </w:rPr>
-        <w:t>init</w:t>
-      </w:r>
-      <w:proofErr w:type="spellEnd"/>
+        <w:t>git init</w:t>
+      </w:r>
     </w:p>
     <w:p>
       <w:pPr>
@@ -480,28 +788,12 @@
           <w:lang w:val="es-PE"/>
         </w:rPr>
       </w:pPr>
-      <w:proofErr w:type="spellStart"/>
       <w:r>
         <w:rPr>
           <w:lang w:val="es-PE"/>
         </w:rPr>
-        <w:t>git</w:t>
-      </w:r>
-      <w:proofErr w:type="spellEnd"/>
-      <w:r>
-        <w:rPr>
-          <w:lang w:val="es-PE"/>
-        </w:rPr>
-        <w:t xml:space="preserve"> </w:t>
-      </w:r>
-      <w:proofErr w:type="gramStart"/>
-      <w:r>
-        <w:rPr>
-          <w:lang w:val="es-PE"/>
-        </w:rPr>
-        <w:t>status</w:t>
-      </w:r>
-      <w:proofErr w:type="gramEnd"/>
+        <w:t>git status</w:t>
+      </w:r>
     </w:p>
     <w:p>
       <w:pPr>
@@ -513,33 +805,11 @@
           <w:lang w:val="es-PE"/>
         </w:rPr>
       </w:pPr>
-      <w:proofErr w:type="spellStart"/>
       <w:r>
         <w:rPr>
           <w:lang w:val="es-PE"/>
         </w:rPr>
-        <w:t>git</w:t>
-      </w:r>
-      <w:proofErr w:type="spellEnd"/>
-      <w:r>
-        <w:rPr>
-          <w:lang w:val="es-PE"/>
-        </w:rPr>
-        <w:t xml:space="preserve"> </w:t>
-      </w:r>
-      <w:proofErr w:type="spellStart"/>
-      <w:r>
-        <w:rPr>
-          <w:lang w:val="es-PE"/>
-        </w:rPr>
-        <w:t>add</w:t>
-      </w:r>
-      <w:proofErr w:type="spellEnd"/>
-      <w:r>
-        <w:rPr>
-          <w:lang w:val="es-PE"/>
-        </w:rPr>
-        <w:t xml:space="preserve"> Integrantes</w:t>
+        <w:t>git add Integrantes</w:t>
       </w:r>
     </w:p>
     <w:p>
@@ -552,33 +822,11 @@
           <w:lang w:val="es-PE"/>
         </w:rPr>
       </w:pPr>
-      <w:proofErr w:type="spellStart"/>
       <w:r>
         <w:rPr>
           <w:lang w:val="es-PE"/>
         </w:rPr>
-        <w:t>git</w:t>
-      </w:r>
-      <w:proofErr w:type="spellEnd"/>
-      <w:r>
-        <w:rPr>
-          <w:lang w:val="es-PE"/>
-        </w:rPr>
-        <w:t xml:space="preserve"> </w:t>
-      </w:r>
-      <w:proofErr w:type="spellStart"/>
-      <w:r>
-        <w:rPr>
-          <w:lang w:val="es-PE"/>
-        </w:rPr>
-        <w:t>commit</w:t>
-      </w:r>
-      <w:proofErr w:type="spellEnd"/>
-      <w:r>
-        <w:rPr>
-          <w:lang w:val="es-PE"/>
-        </w:rPr>
-        <w:t xml:space="preserve"> -m “Subir Carpeta Integrantes”</w:t>
+        <w:t>git commit -m “Subir Carpeta Integrantes”</w:t>
       </w:r>
     </w:p>
     <w:p>
@@ -597,6 +845,14 @@
         </w:rPr>
         <w:t>git push -u origin main</w:t>
       </w:r>
+    </w:p>
+    <w:p>
+      <w:pPr>
+        <w:ind w:left="720"/>
+        <w:rPr>
+          <w:lang w:val="en-US"/>
+        </w:rPr>
+      </w:pPr>
     </w:p>
     <w:p>
       <w:r>
@@ -619,7 +875,7 @@
                     <pic:cNvPicPr/>
                   </pic:nvPicPr>
                   <pic:blipFill>
-                    <a:blip r:embed="rId11"/>
+                    <a:blip r:embed="rId14"/>
                     <a:stretch>
                       <a:fillRect/>
                     </a:stretch>
@@ -662,7 +918,7 @@
                     <pic:cNvPicPr/>
                   </pic:nvPicPr>
                   <pic:blipFill>
-                    <a:blip r:embed="rId12"/>
+                    <a:blip r:embed="rId15"/>
                     <a:stretch>
                       <a:fillRect/>
                     </a:stretch>
@@ -1536,6 +1792,7 @@
   <w:style w:type="character" w:default="1" w:styleId="Fuentedeprrafopredeter">
     <w:name w:val="Default Paragraph Font"/>
     <w:uiPriority w:val="1"/>
+    <w:semiHidden/>
     <w:unhideWhenUsed/>
   </w:style>
   <w:style w:type="table" w:default="1" w:styleId="Tablanormal">

</xml_diff>